<commit_message>
melhoria na pagina de cadastro de atendimento e opcao de litisconsorcio
</commit_message>
<xml_diff>
--- a/modelos/01 - NOVO ATENDIMENTO INICIAL.docx
+++ b/modelos/01 - NOVO ATENDIMENTO INICIAL.docx
@@ -200,7 +200,27 @@
         <w:rPr>
           <w:rFonts w:ascii="Bookman Old Style" w:hAnsi="Bookman Old Style"/>
         </w:rPr>
-        <w:t>{complementoContato}</w:t>
+        <w:t>{</w:t>
+      </w:r>
+      <w:proofErr w:type="spellStart"/>
+      <w:r>
+        <w:rPr>
+          <w:rFonts w:ascii="Bookman Old Style" w:hAnsi="Bookman Old Style"/>
+        </w:rPr>
+        <w:t>complementoContato</w:t>
+      </w:r>
+      <w:proofErr w:type="spellEnd"/>
+      <w:r>
+        <w:rPr>
+          <w:rFonts w:ascii="Bookman Old Style" w:hAnsi="Bookman Old Style"/>
+        </w:rPr>
+        <w:t>}</w:t>
+      </w:r>
+      <w:r>
+        <w:rPr>
+          <w:rFonts w:ascii="Bookman Old Style" w:hAnsi="Bookman Old Style"/>
+        </w:rPr>
+        <w:t>${litis}</w:t>
       </w:r>
     </w:p>
     <w:p>
@@ -396,7 +416,6 @@
           <w:rFonts w:ascii="Bookman Old Style" w:hAnsi="Bookman Old Style"/>
           <w:b/>
           <w:bCs/>
-          <w:lang w:val="en-US"/>
         </w:rPr>
       </w:pPr>
       <w:r>
@@ -404,7 +423,6 @@
           <w:rFonts w:ascii="Bookman Old Style" w:hAnsi="Bookman Old Style"/>
           <w:b/>
           <w:bCs/>
-          <w:lang w:val="en-US"/>
         </w:rPr>
         <w:t>${ASS_LEFT} ${ASS_CENTER} ${ASS_RIGHT}</w:t>
       </w:r>

</xml_diff>